<commit_message>
M-452: a teacher's sub-topic heading is the Cambridge number and title; his own titles go under it (#4442)
Published from Bhatti-Foundation/maktab@71494bfcf1ce (docs/directions/): changed CHANGELOG.md; changed own-file.md; changed sample-lecture.docx.
</commit_message>
<xml_diff>
--- a/sample-lecture.docx
+++ b/sample-lecture.docx
@@ -37,7 +37,7 @@
         <w:pStyle w:val="Heading2"/>
       </w:pPr>
       <w:r>
-        <w:t xml:space="preserve">3.1 Mass and inertia</w:t>
+        <w:t xml:space="preserve">Mass and inertia</w:t>
       </w:r>
     </w:p>
     <w:p>
@@ -194,7 +194,7 @@
         <w:pStyle w:val="Heading2"/>
       </w:pPr>
       <w:r>
-        <w:t xml:space="preserve">3.1 Resultant force and acceleration</w:t>
+        <w:t xml:space="preserve">Resultant force and acceleration</w:t>
       </w:r>
     </w:p>
     <w:p>
@@ -334,7 +334,7 @@
         <w:pStyle w:val="Heading2"/>
       </w:pPr>
       <w:r>
-        <w:t xml:space="preserve">3.1 Check your understanding</w:t>
+        <w:t xml:space="preserve">Check your understanding</w:t>
       </w:r>
     </w:p>
     <w:tbl>
@@ -430,7 +430,7 @@
         <w:pStyle w:val="Heading2"/>
       </w:pPr>
       <w:r>
-        <w:t xml:space="preserve">3.1 Past-paper questions</w:t>
+        <w:t xml:space="preserve">Past-paper questions</w:t>
       </w:r>
     </w:p>
     <w:p>

</xml_diff>

<commit_message>
A teacher's AI marks what only paper needs and lists what it changed; the import leaves both out (#4554)
Published from Bhatti-Foundation/maktab@ec39c8467238 (docs/directions/): changed CHANGELOG.md; changed own-file.md; changed sample-lecture.docx.
</commit_message>
<xml_diff>
--- a/sample-lecture.docx
+++ b/sample-lecture.docx
@@ -24,6 +24,44 @@
         <w:t xml:space="preserve">This chapter is about why things speed up, slow down and change direction. Read it beside your coursebook: these notes add the tips, worked examples and exam pointers.</w:t>
       </w:r>
     </w:p>
+    <w:tbl>
+      <w:tblPr>
+        <w:tblW w:w="5000" w:type="pct"/>
+        <w:tblBorders>
+          <w:top w:val="single" w:sz="4" w:space="0" w:color="A6A6A6"/>
+          <w:left w:val="single" w:sz="4" w:space="0" w:color="A6A6A6"/>
+          <w:bottom w:val="single" w:sz="4" w:space="0" w:color="A6A6A6"/>
+          <w:right w:val="single" w:sz="4" w:space="0" w:color="A6A6A6"/>
+        </w:tblBorders>
+      </w:tblPr>
+      <w:tblGrid>
+        <w:gridCol w:w="9000"/>
+      </w:tblGrid>
+      <w:tr>
+        <w:tc>
+          <w:tcPr>
+            <w:tcW w:w="5000" w:type="pct"/>
+            <w:shd w:val="clear" w:color="auto" w:fill="F2F2F2"/>
+          </w:tcPr>
+          <w:p>
+            <w:pPr/>
+            <w:r>
+              <w:rPr>
+                <w:b/>
+              </w:rPr>
+              <w:t xml:space="preserve">Print only · How to use these notes</w:t>
+            </w:r>
+          </w:p>
+          <w:p>
+            <w:pPr/>
+            <w:r>
+              <w:t xml:space="preserve">Each sub-topic starts with a blue banner. The answers are on the last page.</w:t>
+            </w:r>
+          </w:p>
+        </w:tc>
+      </w:tr>
+    </w:tbl>
+    <w:p/>
     <w:p>
       <w:pPr>
         <w:pStyle w:val="Heading1"/>
@@ -499,6 +537,38 @@
       </w:pPr>
       <w:r>
         <w:t xml:space="preserve">Resultant force equals mass times acceleration, F = ma.</w:t>
+      </w:r>
+    </w:p>
+    <w:p>
+      <w:pPr>
+        <w:pStyle w:val="Heading1"/>
+      </w:pPr>
+      <w:r>
+        <w:t xml:space="preserve">Changes made by AI</w:t>
+      </w:r>
+    </w:p>
+    <w:p>
+      <w:pPr>
+        <w:pStyle w:val="ListBullet"/>
+        <w:numPr>
+          <w:ilvl w:val="0"/>
+          <w:numId w:val="1"/>
+        </w:numPr>
+      </w:pPr>
+      <w:r>
+        <w:t xml:space="preserve">Converted from PDF to Word.</w:t>
+      </w:r>
+    </w:p>
+    <w:p>
+      <w:pPr>
+        <w:pStyle w:val="ListBullet"/>
+        <w:numPr>
+          <w:ilvl w:val="0"/>
+          <w:numId w:val="1"/>
+        </w:numPr>
+      </w:pPr>
+      <w:r>
+        <w:t xml:space="preserve">Rebuilt Figure 3.1 from a scanned page, and retyped F = ma, which the PDF had as a picture.</w:t>
       </w:r>
     </w:p>
     <w:sectPr>

</xml_diff>